<commit_message>
Block geolocation permission prompts in Electron session
</commit_message>
<xml_diff>
--- a/EleMintz Priority Tasks.docx
+++ b/EleMintz Priority Tasks.docx
@@ -28,6 +28,7 @@
         <w:rPr>
           <w:b/>
           <w:bCs/>
+          <w:strike w:val="on"/>
           <w:lang w:val="en-US"/>
         </w:rPr>
       </w:pPr>
@@ -35,6 +36,7 @@
         <w:rPr>
           <w:b/>
           <w:bCs/>
+          <w:strike w:val="on"/>
           <w:lang w:val="en-US"/>
         </w:rPr>
         <w:t>Click Reliability / Input Reliability</w:t>
@@ -43,11 +45,13 @@
     <w:p>
       <w:pPr>
         <w:rPr>
-          <w:lang w:val="en-US"/>
-        </w:rPr>
-      </w:pPr>
-      <w:r>
-        <w:rPr>
+          <w:strike w:val="on"/>
+          <w:lang w:val="en-US"/>
+        </w:rPr>
+      </w:pPr>
+      <w:r>
+        <w:rPr>
+          <w:strike w:val="on"/>
           <w:lang w:val="en-US"/>
         </w:rPr>
         <w:t>This is now top priority because you confirmed it is still bad in:</w:t>
@@ -60,11 +64,13 @@
           <w:numId w:val="2"/>
         </w:numPr>
         <w:rPr>
-          <w:lang w:val="en-US"/>
-        </w:rPr>
-      </w:pPr>
-      <w:r>
-        <w:rPr>
+          <w:strike w:val="on"/>
+          <w:lang w:val="en-US"/>
+        </w:rPr>
+      </w:pPr>
+      <w:r>
+        <w:rPr>
+          <w:strike w:val="on"/>
           <w:lang w:val="en-US"/>
         </w:rPr>
         <w:t>PVP</w:t>
@@ -77,11 +83,13 @@
           <w:numId w:val="2"/>
         </w:numPr>
         <w:rPr>
-          <w:lang w:val="en-US"/>
-        </w:rPr>
-      </w:pPr>
-      <w:r>
-        <w:rPr>
+          <w:strike w:val="on"/>
+          <w:lang w:val="en-US"/>
+        </w:rPr>
+      </w:pPr>
+      <w:r>
+        <w:rPr>
+          <w:strike w:val="on"/>
           <w:lang w:val="en-US"/>
         </w:rPr>
         <w:t>PVE</w:t>
@@ -94,11 +102,13 @@
           <w:numId w:val="2"/>
         </w:numPr>
         <w:rPr>
-          <w:lang w:val="en-US"/>
-        </w:rPr>
-      </w:pPr>
-      <w:r>
-        <w:rPr>
+          <w:strike w:val="on"/>
+          <w:lang w:val="en-US"/>
+        </w:rPr>
+      </w:pPr>
+      <w:r>
+        <w:rPr>
+          <w:strike w:val="on"/>
           <w:lang w:val="en-US"/>
         </w:rPr>
         <w:t>probably online</w:t>
@@ -111,11 +121,13 @@
           <w:numId w:val="2"/>
         </w:numPr>
         <w:rPr>
-          <w:lang w:val="en-US"/>
-        </w:rPr>
-      </w:pPr>
-      <w:r>
-        <w:rPr>
+          <w:strike w:val="on"/>
+          <w:lang w:val="en-US"/>
+        </w:rPr>
+      </w:pPr>
+      <w:r>
+        <w:rPr>
+          <w:strike w:val="on"/>
           <w:lang w:val="en-US"/>
         </w:rPr>
         <w:t>taunt clicking specifically</w:t>
@@ -128,11 +140,13 @@
           <w:numId w:val="2"/>
         </w:numPr>
         <w:rPr>
-          <w:lang w:val="en-US"/>
-        </w:rPr>
-      </w:pPr>
-      <w:r>
-        <w:rPr>
+          <w:strike w:val="on"/>
+          <w:lang w:val="en-US"/>
+        </w:rPr>
+      </w:pPr>
+      <w:r>
+        <w:rPr>
+          <w:strike w:val="on"/>
           <w:lang w:val="en-US"/>
         </w:rPr>
         <w:t>game screen interactions generally</w:t>
@@ -141,11 +155,13 @@
     <w:p>
       <w:pPr>
         <w:rPr>
-          <w:lang w:val="en-US"/>
-        </w:rPr>
-      </w:pPr>
-      <w:r>
-        <w:rPr>
+          <w:strike w:val="on"/>
+          <w:lang w:val="en-US"/>
+        </w:rPr>
+      </w:pPr>
+      <w:r>
+        <w:rPr>
+          <w:strike w:val="on"/>
           <w:lang w:val="en-US"/>
         </w:rPr>
         <w:t>Your features doc already flagged this as a major issue: clicks sometimes do not register and need a deep dive so one single click always works.</w:t>
@@ -154,11 +170,13 @@
     <w:p>
       <w:pPr>
         <w:rPr>
-          <w:lang w:val="en-US"/>
-        </w:rPr>
-      </w:pPr>
-      <w:r>
-        <w:rPr>
+          <w:strike w:val="on"/>
+          <w:lang w:val="en-US"/>
+        </w:rPr>
+      </w:pPr>
+      <w:r>
+        <w:rPr>
+          <w:strike w:val="on"/>
           <w:lang w:val="en-US"/>
         </w:rPr>
         <w:t>What this includes:</w:t>
@@ -171,11 +189,13 @@
           <w:numId w:val="3"/>
         </w:numPr>
         <w:rPr>
-          <w:lang w:val="en-US"/>
-        </w:rPr>
-      </w:pPr>
-      <w:r>
-        <w:rPr>
+          <w:strike w:val="on"/>
+          <w:lang w:val="en-US"/>
+        </w:rPr>
+      </w:pPr>
+      <w:r>
+        <w:rPr>
+          <w:strike w:val="on"/>
           <w:lang w:val="en-US"/>
         </w:rPr>
         <w:t>card click responsiveness</w:t>
@@ -188,11 +208,13 @@
           <w:numId w:val="3"/>
         </w:numPr>
         <w:rPr>
-          <w:lang w:val="en-US"/>
-        </w:rPr>
-      </w:pPr>
-      <w:r>
-        <w:rPr>
+          <w:strike w:val="on"/>
+          <w:lang w:val="en-US"/>
+        </w:rPr>
+      </w:pPr>
+      <w:r>
+        <w:rPr>
+          <w:strike w:val="on"/>
           <w:lang w:val="en-US"/>
         </w:rPr>
         <w:t>button click responsiveness</w:t>
@@ -205,11 +227,13 @@
           <w:numId w:val="3"/>
         </w:numPr>
         <w:rPr>
-          <w:lang w:val="en-US"/>
-        </w:rPr>
-      </w:pPr>
-      <w:r>
-        <w:rPr>
+          <w:strike w:val="on"/>
+          <w:lang w:val="en-US"/>
+        </w:rPr>
+      </w:pPr>
+      <w:r>
+        <w:rPr>
+          <w:strike w:val="on"/>
           <w:lang w:val="en-US"/>
         </w:rPr>
         <w:t>taunt click responsiveness</w:t>
@@ -222,11 +246,13 @@
           <w:numId w:val="3"/>
         </w:numPr>
         <w:rPr>
-          <w:lang w:val="en-US"/>
-        </w:rPr>
-      </w:pPr>
-      <w:r>
-        <w:rPr>
+          <w:strike w:val="on"/>
+          <w:lang w:val="en-US"/>
+        </w:rPr>
+      </w:pPr>
+      <w:r>
+        <w:rPr>
+          <w:strike w:val="on"/>
           <w:lang w:val="en-US"/>
         </w:rPr>
         <w:t>hover/pulse/animation layers not swallowing input</w:t>
@@ -239,11 +265,13 @@
           <w:numId w:val="3"/>
         </w:numPr>
         <w:rPr>
-          <w:lang w:val="en-US"/>
-        </w:rPr>
-      </w:pPr>
-      <w:r>
-        <w:rPr>
+          <w:strike w:val="on"/>
+          <w:lang w:val="en-US"/>
+        </w:rPr>
+      </w:pPr>
+      <w:r>
+        <w:rPr>
+          <w:strike w:val="on"/>
           <w:lang w:val="en-US"/>
         </w:rPr>
         <w:t>z-index / overlay / pointer-events conflicts</w:t>
@@ -256,11 +284,13 @@
           <w:numId w:val="3"/>
         </w:numPr>
         <w:rPr>
-          <w:lang w:val="en-US"/>
-        </w:rPr>
-      </w:pPr>
-      <w:r>
-        <w:rPr>
+          <w:strike w:val="on"/>
+          <w:lang w:val="en-US"/>
+        </w:rPr>
+      </w:pPr>
+      <w:r>
+        <w:rPr>
+          <w:strike w:val="on"/>
           <w:lang w:val="en-US"/>
         </w:rPr>
         <w:t>duplicated listeners or timing/state locks</w:t>
@@ -273,11 +303,13 @@
           <w:numId w:val="3"/>
         </w:numPr>
         <w:rPr>
-          <w:lang w:val="en-US"/>
-        </w:rPr>
-      </w:pPr>
-      <w:r>
-        <w:rPr>
+          <w:strike w:val="on"/>
+          <w:lang w:val="en-US"/>
+        </w:rPr>
+      </w:pPr>
+      <w:r>
+        <w:rPr>
+          <w:strike w:val="on"/>
           <w:lang w:val="en-US"/>
         </w:rPr>
         <w:t>making sure one intentional click always fires once</w:t>
@@ -286,11 +318,13 @@
     <w:p>
       <w:pPr>
         <w:rPr>
-          <w:lang w:val="en-US"/>
-        </w:rPr>
-      </w:pPr>
-      <w:r>
-        <w:rPr>
+          <w:strike w:val="on"/>
+          <w:lang w:val="en-US"/>
+        </w:rPr>
+      </w:pPr>
+      <w:r>
+        <w:rPr>
+          <w:strike w:val="on"/>
           <w:lang w:val="en-US"/>
         </w:rPr>
         <w:t>Why it is #1:</w:t>
@@ -303,11 +337,13 @@
           <w:numId w:val="4"/>
         </w:numPr>
         <w:rPr>
-          <w:lang w:val="en-US"/>
-        </w:rPr>
-      </w:pPr>
-      <w:r>
-        <w:rPr>
+          <w:strike w:val="on"/>
+          <w:lang w:val="en-US"/>
+        </w:rPr>
+      </w:pPr>
+      <w:r>
+        <w:rPr>
+          <w:strike w:val="on"/>
           <w:lang w:val="en-US"/>
         </w:rPr>
         <w:t>this directly hurts gameplay</w:t>
@@ -320,11 +356,13 @@
           <w:numId w:val="4"/>
         </w:numPr>
         <w:rPr>
-          <w:lang w:val="en-US"/>
-        </w:rPr>
-      </w:pPr>
-      <w:r>
-        <w:rPr>
+          <w:strike w:val="on"/>
+          <w:lang w:val="en-US"/>
+        </w:rPr>
+      </w:pPr>
+      <w:r>
+        <w:rPr>
+          <w:strike w:val="on"/>
           <w:lang w:val="en-US"/>
         </w:rPr>
         <w:t>it affects every mode</w:t>
@@ -342,6 +380,7 @@
       </w:pPr>
       <w:r>
         <w:rPr>
+          <w:strike w:val="on"/>
           <w:lang w:val="en-US"/>
         </w:rPr>
         <w:t>it makes the game feel broken even if the backend is solid</w:t>

</xml_diff>